<commit_message>
Head-to-head: decoupled design vs the same generator used alone
New thesis Table 5.29 and Section 5.4.9 text compare both systems on every
measure with reply length held constant. Ours wins on WASSA (+0.30, stronger
under length control), emotion validation (+9.7 pp), repetition (boilerplate
58.7% vs 72.3%, distinct-2 47.8% vs 39.1%) and reply length (-22%); judges
are level; single model leads on rule adherence, an advantage that largely
disappears at matched length (acknowledgement p = 0.36). Diversity metrics
recomputed to cover the new baselines.

Co-Authored-By: Claude Opus 5 (1M context) <noreply@anthropic.com>
</commit_message>
<xml_diff>
--- a/writing/Chapter 5 - 5.1 Performance Evaluation/FINAL_TEXT.docx
+++ b/writing/Chapter 5 - 5.1 Performance Evaluation/FINAL_TEXT.docx
@@ -7330,7 +7330,7 @@
               <w:rPr>
                 <w:sz w:val="13"/>
               </w:rPr>
-              <w:t>rag_pipeline</w:t>
+              <w:t>fine_tuned_fixed</w:t>
             </w:r>
           </w:p>
         </w:tc>
@@ -7358,7 +7358,7 @@
               <w:rPr>
                 <w:sz w:val="13"/>
               </w:rPr>
-              <w:t>12.6</w:t>
+              <w:t>17.35</w:t>
             </w:r>
           </w:p>
         </w:tc>
@@ -7372,7 +7372,7 @@
               <w:rPr>
                 <w:sz w:val="13"/>
               </w:rPr>
-              <w:t>53.62</w:t>
+              <w:t>56.09</w:t>
             </w:r>
           </w:p>
         </w:tc>
@@ -7386,7 +7386,7 @@
               <w:rPr>
                 <w:sz w:val="13"/>
               </w:rPr>
-              <w:t>76.91</w:t>
+              <w:t>78.16</w:t>
             </w:r>
           </w:p>
         </w:tc>
@@ -7400,7 +7400,7 @@
               <w:rPr>
                 <w:sz w:val="13"/>
               </w:rPr>
-              <w:t>26.7</w:t>
+              <w:t>9.7</w:t>
             </w:r>
           </w:p>
         </w:tc>
@@ -7414,7 +7414,7 @@
               <w:rPr>
                 <w:sz w:val="13"/>
               </w:rPr>
-              <w:t>is there anything specific about</w:t>
+              <w:t>how long have you been</w:t>
             </w:r>
           </w:p>
         </w:tc>
@@ -7428,7 +7428,7 @@
               <w:rPr>
                 <w:sz w:val="13"/>
               </w:rPr>
-              <w:t>25</w:t>
+              <w:t>4</w:t>
             </w:r>
           </w:p>
         </w:tc>
@@ -7444,7 +7444,7 @@
               <w:rPr>
                 <w:sz w:val="13"/>
               </w:rPr>
-              <w:t>single_model_same_size</w:t>
+              <w:t>rag_pipeline</w:t>
             </w:r>
           </w:p>
         </w:tc>
@@ -7472,7 +7472,7 @@
               <w:rPr>
                 <w:sz w:val="13"/>
               </w:rPr>
-              <w:t>11.35</w:t>
+              <w:t>12.6</w:t>
             </w:r>
           </w:p>
         </w:tc>
@@ -7486,7 +7486,7 @@
               <w:rPr>
                 <w:sz w:val="13"/>
               </w:rPr>
-              <w:t>50.5</w:t>
+              <w:t>53.62</w:t>
             </w:r>
           </w:p>
         </w:tc>
@@ -7500,7 +7500,7 @@
               <w:rPr>
                 <w:sz w:val="13"/>
               </w:rPr>
-              <w:t>73.68</w:t>
+              <w:t>76.91</w:t>
             </w:r>
           </w:p>
         </w:tc>
@@ -7514,7 +7514,7 @@
               <w:rPr>
                 <w:sz w:val="13"/>
               </w:rPr>
-              <w:t>35</w:t>
+              <w:t>26.7</w:t>
             </w:r>
           </w:p>
         </w:tc>
@@ -7542,7 +7542,7 @@
               <w:rPr>
                 <w:sz w:val="13"/>
               </w:rPr>
-              <w:t>23</w:t>
+              <w:t>25</w:t>
             </w:r>
           </w:p>
         </w:tc>
@@ -7558,7 +7558,7 @@
               <w:rPr>
                 <w:sz w:val="13"/>
               </w:rPr>
-              <w:t>prompt_engineered_pipeline</w:t>
+              <w:t>single_model_same_size</w:t>
             </w:r>
           </w:p>
         </w:tc>
@@ -7586,7 +7586,7 @@
               <w:rPr>
                 <w:sz w:val="13"/>
               </w:rPr>
-              <w:t>11.91</w:t>
+              <w:t>11.35</w:t>
             </w:r>
           </w:p>
         </w:tc>
@@ -7600,7 +7600,7 @@
               <w:rPr>
                 <w:sz w:val="13"/>
               </w:rPr>
-              <w:t>49.49</w:t>
+              <w:t>50.5</w:t>
             </w:r>
           </w:p>
         </w:tc>
@@ -7614,7 +7614,7 @@
               <w:rPr>
                 <w:sz w:val="13"/>
               </w:rPr>
-              <w:t>72.43</w:t>
+              <w:t>73.68</w:t>
             </w:r>
           </w:p>
         </w:tc>
@@ -7628,7 +7628,7 @@
               <w:rPr>
                 <w:sz w:val="13"/>
               </w:rPr>
-              <w:t>23.7</w:t>
+              <w:t>35</w:t>
             </w:r>
           </w:p>
         </w:tc>
@@ -7642,7 +7642,7 @@
               <w:rPr>
                 <w:sz w:val="13"/>
               </w:rPr>
-              <w:t>what would you like to</w:t>
+              <w:t>is there anything specific about</w:t>
             </w:r>
           </w:p>
         </w:tc>
@@ -7656,7 +7656,7 @@
               <w:rPr>
                 <w:sz w:val="13"/>
               </w:rPr>
-              <w:t>21</w:t>
+              <w:t>23</w:t>
             </w:r>
           </w:p>
         </w:tc>
@@ -7672,7 +7672,7 @@
               <w:rPr>
                 <w:sz w:val="13"/>
               </w:rPr>
-              <w:t>two_stage_phi</w:t>
+              <w:t>prompt_engineered_pipeline</w:t>
             </w:r>
           </w:p>
         </w:tc>
@@ -7700,7 +7700,7 @@
               <w:rPr>
                 <w:sz w:val="13"/>
               </w:rPr>
-              <w:t>11.5</w:t>
+              <w:t>11.91</w:t>
             </w:r>
           </w:p>
         </w:tc>
@@ -7714,7 +7714,7 @@
               <w:rPr>
                 <w:sz w:val="13"/>
               </w:rPr>
-              <w:t>47.84</w:t>
+              <w:t>49.49</w:t>
             </w:r>
           </w:p>
         </w:tc>
@@ -7728,7 +7728,7 @@
               <w:rPr>
                 <w:sz w:val="13"/>
               </w:rPr>
-              <w:t>71.54</w:t>
+              <w:t>72.43</w:t>
             </w:r>
           </w:p>
         </w:tc>
@@ -7742,7 +7742,7 @@
               <w:rPr>
                 <w:sz w:val="13"/>
               </w:rPr>
-              <w:t>58.7</w:t>
+              <w:t>23.7</w:t>
             </w:r>
           </w:p>
         </w:tc>
@@ -7756,7 +7756,7 @@
               <w:rPr>
                 <w:sz w:val="13"/>
               </w:rPr>
-              <w:t>how are you feeling right</w:t>
+              <w:t>what would you like to</w:t>
             </w:r>
           </w:p>
         </w:tc>
@@ -7770,7 +7770,7 @@
               <w:rPr>
                 <w:sz w:val="13"/>
               </w:rPr>
-              <w:t>49</w:t>
+              <w:t>21</w:t>
             </w:r>
           </w:p>
         </w:tc>
@@ -7786,6 +7786,120 @@
               <w:rPr>
                 <w:sz w:val="13"/>
               </w:rPr>
+              <w:t>two_stage_phi</w:t>
+            </w:r>
+          </w:p>
+        </w:tc>
+        <w:tc>
+          <w:tcPr>
+            <w:tcW w:type="dxa" w:w="1170"/>
+          </w:tcPr>
+          <w:p>
+            <w:r/>
+            <w:r>
+              <w:rPr>
+                <w:sz w:val="13"/>
+              </w:rPr>
+              <w:t>300</w:t>
+            </w:r>
+          </w:p>
+        </w:tc>
+        <w:tc>
+          <w:tcPr>
+            <w:tcW w:type="dxa" w:w="1170"/>
+          </w:tcPr>
+          <w:p>
+            <w:r/>
+            <w:r>
+              <w:rPr>
+                <w:sz w:val="13"/>
+              </w:rPr>
+              <w:t>11.5</w:t>
+            </w:r>
+          </w:p>
+        </w:tc>
+        <w:tc>
+          <w:tcPr>
+            <w:tcW w:type="dxa" w:w="1170"/>
+          </w:tcPr>
+          <w:p>
+            <w:r/>
+            <w:r>
+              <w:rPr>
+                <w:sz w:val="13"/>
+              </w:rPr>
+              <w:t>47.84</w:t>
+            </w:r>
+          </w:p>
+        </w:tc>
+        <w:tc>
+          <w:tcPr>
+            <w:tcW w:type="dxa" w:w="1170"/>
+          </w:tcPr>
+          <w:p>
+            <w:r/>
+            <w:r>
+              <w:rPr>
+                <w:sz w:val="13"/>
+              </w:rPr>
+              <w:t>71.54</w:t>
+            </w:r>
+          </w:p>
+        </w:tc>
+        <w:tc>
+          <w:tcPr>
+            <w:tcW w:type="dxa" w:w="1170"/>
+          </w:tcPr>
+          <w:p>
+            <w:r/>
+            <w:r>
+              <w:rPr>
+                <w:sz w:val="13"/>
+              </w:rPr>
+              <w:t>58.7</w:t>
+            </w:r>
+          </w:p>
+        </w:tc>
+        <w:tc>
+          <w:tcPr>
+            <w:tcW w:type="dxa" w:w="1170"/>
+          </w:tcPr>
+          <w:p>
+            <w:r/>
+            <w:r>
+              <w:rPr>
+                <w:sz w:val="13"/>
+              </w:rPr>
+              <w:t>how are you feeling right</w:t>
+            </w:r>
+          </w:p>
+        </w:tc>
+        <w:tc>
+          <w:tcPr>
+            <w:tcW w:type="dxa" w:w="1170"/>
+          </w:tcPr>
+          <w:p>
+            <w:r/>
+            <w:r>
+              <w:rPr>
+                <w:sz w:val="13"/>
+              </w:rPr>
+              <w:t>49</w:t>
+            </w:r>
+          </w:p>
+        </w:tc>
+      </w:tr>
+      <w:tr>
+        <w:tc>
+          <w:tcPr>
+            <w:tcW w:type="dxa" w:w="1170"/>
+          </w:tcPr>
+          <w:p>
+            <w:r/>
+            <w:r>
+              <w:rPr>
+                <w:sz w:val="13"/>
+              </w:rPr>
               <w:t>single_model_bigger</w:t>
             </w:r>
           </w:p>
@@ -7885,6 +7999,120 @@
                 <w:sz w:val="13"/>
               </w:rPr>
               <w:t>67</w:t>
+            </w:r>
+          </w:p>
+        </w:tc>
+      </w:tr>
+      <w:tr>
+        <w:tc>
+          <w:tcPr>
+            <w:tcW w:type="dxa" w:w="1170"/>
+          </w:tcPr>
+          <w:p>
+            <w:r/>
+            <w:r>
+              <w:rPr>
+                <w:sz w:val="13"/>
+              </w:rPr>
+              <w:t>single_model_phi</w:t>
+            </w:r>
+          </w:p>
+        </w:tc>
+        <w:tc>
+          <w:tcPr>
+            <w:tcW w:type="dxa" w:w="1170"/>
+          </w:tcPr>
+          <w:p>
+            <w:r/>
+            <w:r>
+              <w:rPr>
+                <w:sz w:val="13"/>
+              </w:rPr>
+              <w:t>300</w:t>
+            </w:r>
+          </w:p>
+        </w:tc>
+        <w:tc>
+          <w:tcPr>
+            <w:tcW w:type="dxa" w:w="1170"/>
+          </w:tcPr>
+          <w:p>
+            <w:r/>
+            <w:r>
+              <w:rPr>
+                <w:sz w:val="13"/>
+              </w:rPr>
+              <w:t>8.62</w:t>
+            </w:r>
+          </w:p>
+        </w:tc>
+        <w:tc>
+          <w:tcPr>
+            <w:tcW w:type="dxa" w:w="1170"/>
+          </w:tcPr>
+          <w:p>
+            <w:r/>
+            <w:r>
+              <w:rPr>
+                <w:sz w:val="13"/>
+              </w:rPr>
+              <w:t>39.12</w:t>
+            </w:r>
+          </w:p>
+        </w:tc>
+        <w:tc>
+          <w:tcPr>
+            <w:tcW w:type="dxa" w:w="1170"/>
+          </w:tcPr>
+          <w:p>
+            <w:r/>
+            <w:r>
+              <w:rPr>
+                <w:sz w:val="13"/>
+              </w:rPr>
+              <w:t>62.4</w:t>
+            </w:r>
+          </w:p>
+        </w:tc>
+        <w:tc>
+          <w:tcPr>
+            <w:tcW w:type="dxa" w:w="1170"/>
+          </w:tcPr>
+          <w:p>
+            <w:r/>
+            <w:r>
+              <w:rPr>
+                <w:sz w:val="13"/>
+              </w:rPr>
+              <w:t>72.3</w:t>
+            </w:r>
+          </w:p>
+        </w:tc>
+        <w:tc>
+          <w:tcPr>
+            <w:tcW w:type="dxa" w:w="1170"/>
+          </w:tcPr>
+          <w:p>
+            <w:r/>
+            <w:r>
+              <w:rPr>
+                <w:sz w:val="13"/>
+              </w:rPr>
+              <w:t>it's completely normal to feel</w:t>
+            </w:r>
+          </w:p>
+        </w:tc>
+        <w:tc>
+          <w:tcPr>
+            <w:tcW w:type="dxa" w:w="1170"/>
+          </w:tcPr>
+          <w:p>
+            <w:r/>
+            <w:r>
+              <w:rPr>
+                <w:sz w:val="13"/>
+              </w:rPr>
+              <w:t>65</w:t>
             </w:r>
           </w:p>
         </w:tc>

</xml_diff>